<commit_message>
docs: backlog e visão geral atualizados para o NFC no ESP32
Por definição do professor, a leitura de tags NFC é feita pelo ESP32.
Por definição do PO, o mesmo ESP32 grava nas tags um código gerado pelo
backend, a pedido do mobile-registry ou do frontend.

BACKLOG.md
- épico 1: US-11 e US-12 passam a pedir a gravação e revogar tags
- épico 2: US-09 e US-10 tratam do resultado e do aviso de leitor
  ocupado; o terminal não usa NFC
- épico 4: novas US-22 a US-25 (leitor e gravador NFC, leitura,
  gravação e convivência dos dois modos)
- épico 5: US-05, US-09, US-12 e US-15 ajustadas (código com hash,
  tópicos nfc e enroll, autenticação MQTT dos terminais)
- épico 6: US-07 pede a gravação pelo navegador

access-control-visao-geral.docx
- seções do mobile-readings, mobile-registry, backend, device-esp32 e
  frontend corrigidas; nota de atualização no início

RISCOS.md: total de histórias ajustado para cerca de 170.
</commit_message>
<xml_diff>
--- a/docs/access-control-visao-geral.docx
+++ b/docs/access-control-visao-geral.docx
@@ -167,6 +167,19 @@
           <w:szCs w:val="22"/>
         </w:rPr>
         <w:t xml:space="preserve"> é um sistema integrado de controle de acesso de baixo custo para edifícios, desenvolvido na disciplina de ABP (4º DSM, FATEC Jacareí, 2026-2). A liberação de uma catraca ou fechadura é decidida a partir de credenciais lidas por QR Code, tag NFC ou reconhecimento facial (extra), com validação centralizada em um backend e registro de toda tentativa de acesso.</w:t>
+      </w:r>
+    </w:p>
+    <w:p>
+      <w:pPr>
+        <w:spacing w:after="120" w:line="276"/>
+      </w:pPr>
+      <w:r>
+        <w:rPr>
+          <w:rFonts w:ascii="Calibri" w:cs="Calibri" w:eastAsia="Calibri" w:hAnsi="Calibri"/>
+          <w:sz w:val="22"/>
+          <w:szCs w:val="22"/>
+        </w:rPr>
+        <w:t xml:space="preserve">Atualização de 18/10/2026: por definição do professor, a leitura de tags NFC é feita por um leitor ligado ao ESP32, e não pelo celular. Por definição do Product Owner, o mesmo ESP32 grava nas tags um código gerado pelo backend, a pedido do mobile-registry ou do frontend. O mobile-readings (terminal) não usa NFC. A descrição atualizada está em docs/arquitetura.md, que prevalece sobre este documento nesses pontos.</w:t>
       </w:r>
     </w:p>
     <w:p>
@@ -451,7 +464,7 @@
                 <w:sz w:val="20"/>
                 <w:szCs w:val="20"/>
               </w:rPr>
-              <w:t xml:space="preserve">Terminal de acesso: lê NFC e facial, exibe o QR Code</w:t>
+              <w:t xml:space="preserve">Terminal de acesso: exibe o QR Code e o resultado e lê a foto (facial). Não usa NFC</w:t>
             </w:r>
           </w:p>
         </w:tc>
@@ -566,7 +579,7 @@
                 <w:sz w:val="20"/>
                 <w:szCs w:val="20"/>
               </w:rPr>
-              <w:t xml:space="preserve">Cadastro de usuários, tags e biometria facial</w:t>
+              <w:t xml:space="preserve">Cadastro de usuários, biometria facial e pedido de gravação de tags</w:t>
             </w:r>
           </w:p>
         </w:tc>
@@ -769,7 +782,7 @@
                 <w:sz w:val="20"/>
                 <w:szCs w:val="20"/>
               </w:rPr>
-              <w:t xml:space="preserve">ESP32, HC-SR04, fechadura, buzzer</w:t>
+              <w:t xml:space="preserve">ESP32 (Arduino), leitor e gravador NFC, HC-SR04, fechadura, buzzer</w:t>
             </w:r>
           </w:p>
         </w:tc>
@@ -796,7 +809,7 @@
                 <w:sz w:val="20"/>
                 <w:szCs w:val="20"/>
               </w:rPr>
-              <w:t xml:space="preserve">Presença, atuação e sinalização</w:t>
+              <w:t xml:space="preserve">Leitura e gravação de tags NFC, presença, atuação e sinalização</w:t>
             </w:r>
           </w:p>
         </w:tc>
@@ -1093,15 +1106,7 @@
           <w:sz w:val="22"/>
           <w:szCs w:val="22"/>
         </w:rPr>
-        <w:t xml:space="preserve">Backend ↔ ESP32:</w:t>
-      </w:r>
-      <w:r>
-        <w:rPr>
-          <w:rFonts w:ascii="Calibri" w:cs="Calibri" w:eastAsia="Calibri" w:hAnsi="Calibri"/>
-          <w:sz w:val="22"/>
-          <w:szCs w:val="22"/>
-        </w:rPr>
-        <w:t xml:space="preserve"> MQTT (comandos de abertura, estado do terminal).</w:t>
+        <w:t xml:space="preserve">Backend ↔ ESP32: MQTT (comandos de abertura, gravação e leitura de tags, estado do terminal).</w:t>
       </w:r>
     </w:p>
     <w:p>
@@ -1121,15 +1126,7 @@
           <w:sz w:val="22"/>
           <w:szCs w:val="22"/>
         </w:rPr>
-        <w:t xml:space="preserve">mobile-readings ↔ broker:</w:t>
-      </w:r>
-      <w:r>
-        <w:rPr>
-          <w:rFonts w:ascii="Calibri" w:cs="Calibri" w:eastAsia="Calibri" w:hAnsi="Calibri"/>
-          <w:sz w:val="22"/>
-          <w:szCs w:val="22"/>
-        </w:rPr>
-        <w:t xml:space="preserve"> MQTT direto, apenas para assinar eventos de presença.</w:t>
+        <w:t xml:space="preserve">mobile-readings ↔ broker: MQTT direto, apenas para assinar eventos de presença e o resultado dos acessos.</w:t>
       </w:r>
     </w:p>
     <w:p>
@@ -1192,25 +1189,7 @@
           <w:sz w:val="22"/>
           <w:szCs w:val="22"/>
         </w:rPr>
-        <w:t xml:space="preserve">O </w:t>
-      </w:r>
-      <w:r>
-        <w:rPr>
-          <w:rFonts w:ascii="Calibri" w:cs="Calibri" w:eastAsia="Calibri" w:hAnsi="Calibri"/>
-          <w:b/>
-          <w:bCs/>
-          <w:sz w:val="22"/>
-          <w:szCs w:val="22"/>
-        </w:rPr>
-        <w:t xml:space="preserve">mobile-readings</w:t>
-      </w:r>
-      <w:r>
-        <w:rPr>
-          <w:rFonts w:ascii="Calibri" w:cs="Calibri" w:eastAsia="Calibri" w:hAnsi="Calibri"/>
-          <w:sz w:val="22"/>
-          <w:szCs w:val="22"/>
-        </w:rPr>
-        <w:t xml:space="preserve"> é o aplicativo que faz o papel de Terminal de Acesso (RF11). Fica fixo junto à entrada, em um dispositivo dedicado, e concentra três funções: exibir o QR Code rotativo, ler tags NFC e reconhecer rostos. Também é o elo entre o sensor de presença do ESP32 e o fluxo de leitura: ele permanece em repouso até que o sensor detecte alguém se aproximando.</w:t>
+        <w:t xml:space="preserve">O mobile-readings é o aplicativo que faz o papel de Terminal de Acesso (RF11). Fica fixo junto à entrada, em um dispositivo dedicado, e concentra duas funções: exibir o QR Code rotativo e o resultado do acesso, e reconhecer rostos (extra). Por definição do professor, ele não lê NFC: a leitura e a gravação das tags são feitas pelo ESP32. Também é o elo entre o sensor de presença do ESP32 e o fluxo de leitura: ele permanece em repouso até que o sensor detecte alguém se aproximando.</w:t>
       </w:r>
     </w:p>
     <w:p>
@@ -1223,7 +1202,7 @@
           <w:sz w:val="22"/>
           <w:szCs w:val="22"/>
         </w:rPr>
-        <w:t xml:space="preserve">Como RF11 pede tela, sensor NFC e conexão de rede, o próprio aparelho cobre esses itens (tela do celular ou tablet, leitor NFC nativo, Wi-Fi). O GPS é tratado como coordenada fixa do terminal cadastrada no backend, conforme permitido pelo RP08.</w:t>
+        <w:t xml:space="preserve">Como RF11 pede tela, sensor NFC e conexão de rede, o terminal é composto por dois elementos: o aparelho (tela do celular ou tablet, câmera e Wi-Fi) e o ESP32 (leitor e gravador NFC, sensor de presença, trava e buzzer). O GPS é tratado como coordenada fixa do terminal cadastrada no backend, conforme permitido pelo RP08.</w:t>
       </w:r>
     </w:p>
     <w:p>
@@ -1270,7 +1249,7 @@
           <w:sz w:val="22"/>
           <w:szCs w:val="22"/>
         </w:rPr>
-        <w:t xml:space="preserve">Ler tags NFC e enviar o identificador ao backend para validação (RF10, RF14).</w:t>
+        <w:t xml:space="preserve">Exibir o resultado de cada acesso, inclusive o das tags NFC lidas pelo ESP32, recebido do backend por MQTT (RF10, RF16).</w:t>
       </w:r>
     </w:p>
     <w:p>
@@ -1541,7 +1520,7 @@
                 <w:sz w:val="20"/>
                 <w:szCs w:val="20"/>
               </w:rPr>
-              <w:t xml:space="preserve">Tela econômica, sem câmera e sem leitor NFC ativos</w:t>
+              <w:t xml:space="preserve">Tela econômica e sem câmera ativa</w:t>
             </w:r>
           </w:p>
         </w:tc>
@@ -1629,7 +1608,7 @@
                 <w:sz w:val="20"/>
                 <w:szCs w:val="20"/>
               </w:rPr>
-              <w:t xml:space="preserve">Leitor NFC e câmera ativos, QR Code visível</w:t>
+              <w:t xml:space="preserve">Câmera ativa (quando o facial estiver habilitado) e QR Code visível</w:t>
             </w:r>
           </w:p>
         </w:tc>
@@ -2063,7 +2042,7 @@
         <w:rPr>
           <w:rFonts w:ascii="Calibri" w:cs="Calibri" w:eastAsia="Calibri" w:hAnsi="Calibri"/>
         </w:rPr>
-        <w:t xml:space="preserve">b) Leitura de tag NFC</w:t>
+        <w:t xml:space="preserve">b) Resultado do acesso por tag NFC</w:t>
       </w:r>
     </w:p>
     <w:p>
@@ -2081,7 +2060,7 @@
           <w:sz w:val="22"/>
           <w:szCs w:val="22"/>
         </w:rPr>
-        <w:t xml:space="preserve">Leitura do identificador único (UID) da tag usando a API NFC nativa.</w:t>
+        <w:t xml:space="preserve">O app assina terminal/{id}/result no MQTT e exibe liberado ou negado, com motivo genérico.</w:t>
       </w:r>
     </w:p>
     <w:p>
@@ -2099,24 +2078,7 @@
           <w:sz w:val="22"/>
           <w:szCs w:val="22"/>
         </w:rPr>
-        <w:t xml:space="preserve">Envio ao backend por </w:t>
-      </w:r>
-      <w:r>
-        <w:rPr>
-          <w:rFonts w:ascii="Consolas" w:cs="Consolas" w:eastAsia="Consolas" w:hAnsi="Consolas"/>
-          <w:sz w:val="22"/>
-          <w:szCs w:val="22"/>
-          <w:shd w:fill="EEF1F5" w:val="clear"/>
-        </w:rPr>
-        <w:t xml:space="preserve">POST /access/nfc</w:t>
-      </w:r>
-      <w:r>
-        <w:rPr>
-          <w:rFonts w:ascii="Calibri" w:cs="Calibri" w:eastAsia="Calibri" w:hAnsi="Calibri"/>
-          <w:sz w:val="22"/>
-          <w:szCs w:val="22"/>
-        </w:rPr>
-        <w:t xml:space="preserve"> com o UID e o identificador do terminal.</w:t>
+        <w:t xml:space="preserve">O app não lê NFC: a tag é lida pelo leitor do ESP32 e o código segue por MQTT até o backend.</w:t>
       </w:r>
     </w:p>
     <w:p>
@@ -2134,7 +2096,7 @@
           <w:sz w:val="22"/>
           <w:szCs w:val="22"/>
         </w:rPr>
-        <w:t xml:space="preserve">A tag funciona apenas como identificador, e o backend resolve a quem pertence e se há autorização válida para o local (RF14).</w:t>
+        <w:t xml:space="preserve">O backend resolve a quem pertence a tag e se há autorização válida para o local (RF14), e publica o comando de abertura e o resultado.</w:t>
       </w:r>
     </w:p>
     <w:p>
@@ -2792,7 +2754,7 @@
                 <w:szCs w:val="20"/>
                 <w:shd w:fill="EEF1F5" w:val="clear"/>
               </w:rPr>
-              <w:t xml:space="preserve">POST /access/nfc</w:t>
+              <w:t xml:space="preserve">terminal/{id}/result</w:t>
             </w:r>
           </w:p>
         </w:tc>
@@ -2819,7 +2781,7 @@
                 <w:sz w:val="20"/>
                 <w:szCs w:val="20"/>
               </w:rPr>
-              <w:t xml:space="preserve">HTTP</w:t>
+              <w:t xml:space="preserve">MQTT (assinatura)</w:t>
             </w:r>
           </w:p>
         </w:tc>
@@ -2846,7 +2808,7 @@
                 <w:sz w:val="20"/>
                 <w:szCs w:val="20"/>
               </w:rPr>
-              <w:t xml:space="preserve">Enviar UID da tag para validação</w:t>
+              <w:t xml:space="preserve">Resultado do acesso, para a tela do terminal</w:t>
             </w:r>
           </w:p>
         </w:tc>
@@ -3377,24 +3339,7 @@
           <w:sz w:val="22"/>
           <w:szCs w:val="22"/>
         </w:rPr>
-        <w:t xml:space="preserve">Isso permite ajustar o app ao trocar de rede, sem recompilar. No Android, é necessário habilitar </w:t>
-      </w:r>
-      <w:r>
-        <w:rPr>
-          <w:rFonts w:ascii="Consolas" w:cs="Consolas" w:eastAsia="Consolas" w:hAnsi="Consolas"/>
-          <w:sz w:val="22"/>
-          <w:szCs w:val="22"/>
-          <w:shd w:fill="EEF1F5" w:val="clear"/>
-        </w:rPr>
-        <w:t xml:space="preserve">usesCleartextTraffic</w:t>
-      </w:r>
-      <w:r>
-        <w:rPr>
-          <w:rFonts w:ascii="Calibri" w:cs="Calibri" w:eastAsia="Calibri" w:hAnsi="Calibri"/>
-          <w:sz w:val="22"/>
-          <w:szCs w:val="22"/>
-        </w:rPr>
-        <w:t xml:space="preserve"> para HTTP sem TLS na LAN, e conceder as permissões de câmera e NFC.</w:t>
+        <w:t xml:space="preserve">Isso permite ajustar o app ao trocar de rede, sem recompilar. No Android, é necessário habilitar usesCleartextTraffic para HTTP sem TLS na LAN, e conceder a permissão de câmera.</w:t>
       </w:r>
     </w:p>
     <w:p>
@@ -3546,7 +3491,7 @@
                 <w:sz w:val="20"/>
                 <w:szCs w:val="20"/>
               </w:rPr>
-              <w:t xml:space="preserve">Lê a tag NFC e encaminha ao backend</w:t>
+              <w:t xml:space="preserve">Mostra o resultado dos acessos por NFC, recebido por MQTT</w:t>
             </w:r>
           </w:p>
         </w:tc>
@@ -3605,7 +3550,7 @@
                 <w:sz w:val="20"/>
                 <w:szCs w:val="20"/>
               </w:rPr>
-              <w:t xml:space="preserve">Compõe o Terminal de Acesso: tela, NFC, rede</w:t>
+              <w:t xml:space="preserve">Compõe o Terminal de Acesso: tela e rede (o NFC é do ESP32)</w:t>
             </w:r>
           </w:p>
         </w:tc>
@@ -4057,15 +4002,7 @@
           <w:sz w:val="22"/>
           <w:szCs w:val="22"/>
         </w:rPr>
-        <w:t xml:space="preserve">Suporte a NFC:</w:t>
-      </w:r>
-      <w:r>
-        <w:rPr>
-          <w:rFonts w:ascii="Calibri" w:cs="Calibri" w:eastAsia="Calibri" w:hAnsi="Calibri"/>
-          <w:sz w:val="22"/>
-          <w:szCs w:val="22"/>
-        </w:rPr>
-        <w:t xml:space="preserve"> o aparelho usado como terminal precisa ter leitor NFC e rodar Android. No iOS, a leitura em segundo plano é limitada.</w:t>
+        <w:t xml:space="preserve">Sem NFC no terminal: por definição do professor, a leitura de tags é feita pelo ESP32, então o aparelho do terminal não precisa de leitor NFC.</w:t>
       </w:r>
     </w:p>
     <w:p>
@@ -4212,25 +4149,7 @@
           <w:sz w:val="22"/>
           <w:szCs w:val="22"/>
         </w:rPr>
-        <w:t xml:space="preserve">O </w:t>
-      </w:r>
-      <w:r>
-        <w:rPr>
-          <w:rFonts w:ascii="Calibri" w:cs="Calibri" w:eastAsia="Calibri" w:hAnsi="Calibri"/>
-          <w:b/>
-          <w:bCs/>
-          <w:sz w:val="22"/>
-          <w:szCs w:val="22"/>
-        </w:rPr>
-        <w:t xml:space="preserve">mobile-registry</w:t>
-      </w:r>
-      <w:r>
-        <w:rPr>
-          <w:rFonts w:ascii="Calibri" w:cs="Calibri" w:eastAsia="Calibri" w:hAnsi="Calibri"/>
-          <w:sz w:val="22"/>
-          <w:szCs w:val="22"/>
-        </w:rPr>
-        <w:t xml:space="preserve"> é o aplicativo de cadastro, usado por quem administra o sistema (portaria ou administração do prédio). Com ele, um administrador cria o usuário, vincula uma tag NFC e registra o rosto, tudo no próprio celular, aproveitando a câmera e o leitor NFC do aparelho.</w:t>
+        <w:t xml:space="preserve">O mobile-registry é o aplicativo de cadastro, usado por quem administra o sistema (portaria ou administração do prédio). Com ele, um administrador cria o usuário, pede a gravação de uma tag NFC e registra o rosto, aproveitando a câmera do aparelho. A tag é gravada pelo ESP32 do terminal, com um código gerado pelo backend; o app não usa o NFC do celular.</w:t>
       </w:r>
     </w:p>
     <w:p>
@@ -4243,7 +4162,7 @@
           <w:sz w:val="22"/>
           <w:szCs w:val="22"/>
         </w:rPr>
-        <w:t xml:space="preserve">Ele é o ponto de entrada dos dados que os demais serviços consomem: as tags são lidas pelo mobile-readings, os embeddings faciais são baixados por ele, e os usuários cadastrados fazem login no mobile-user. O app também tem uma função redundante com o frontend (item E), de modo que o cadastro continue possível se um dos dois falhar durante a apresentação.</w:t>
+        <w:t xml:space="preserve">Ele é o ponto de entrada dos dados que os demais serviços consomem: as tags são gravadas e lidas pelo ESP32, os embeddings faciais são baixados pelo mobile-readings, e os usuários cadastrados fazem login no mobile-user. O app também tem uma função redundante com o frontend (item E), de modo que o cadastro continue possível se um dos dois falhar durante a apresentação.</w:t>
       </w:r>
     </w:p>
     <w:p>
@@ -4308,7 +4227,7 @@
           <w:sz w:val="22"/>
           <w:szCs w:val="22"/>
         </w:rPr>
-        <w:t xml:space="preserve">Ler uma tag NFC e vinculá-la a um usuário.</w:t>
+        <w:t xml:space="preserve">Pedir ao backend a gravação de uma tag NFC para um usuário.</w:t>
       </w:r>
     </w:p>
     <w:p>
@@ -4631,7 +4550,7 @@
                 <w:sz w:val="20"/>
                 <w:szCs w:val="20"/>
               </w:rPr>
-              <w:t xml:space="preserve">2. Tag NFC</w:t>
+              <w:t xml:space="preserve">2. Gravação da tag NFC</w:t>
             </w:r>
           </w:p>
         </w:tc>
@@ -4658,7 +4577,7 @@
                 <w:sz w:val="20"/>
                 <w:szCs w:val="20"/>
               </w:rPr>
-              <w:t xml:space="preserve">Aproximar a tag do celular para capturar o UID</w:t>
+              <w:t xml:space="preserve">Pedir a gravação e aproximar a tag do leitor do terminal</w:t>
             </w:r>
           </w:p>
         </w:tc>
@@ -5116,7 +5035,7 @@
         <w:rPr>
           <w:rFonts w:ascii="Calibri" w:cs="Calibri" w:eastAsia="Calibri" w:hAnsi="Calibri"/>
         </w:rPr>
-        <w:t xml:space="preserve">c) Cadastro de tag NFC</w:t>
+        <w:t xml:space="preserve">c) Gravação de tag NFC</w:t>
       </w:r>
     </w:p>
     <w:p>
@@ -5134,7 +5053,7 @@
           <w:sz w:val="22"/>
           <w:szCs w:val="22"/>
         </w:rPr>
-        <w:t xml:space="preserve">Leitura do UID pela API NFC nativa, a mesma usada no mobile-readings, para garantir o mesmo formato (por exemplo, hexadecimal em maiúsculas, sempre na mesma ordem de bytes).</w:t>
+        <w:t xml:space="preserve">O app não usa o NFC do celular. Ele envia POST /users/{id}/tags informando o terminal; o backend gera um código aleatório e comanda o ESP32, que grava o código na tag.</w:t>
       </w:r>
     </w:p>
     <w:p>
@@ -5152,24 +5071,7 @@
           <w:sz w:val="22"/>
           <w:szCs w:val="22"/>
         </w:rPr>
-        <w:t xml:space="preserve">Envio por </w:t>
-      </w:r>
-      <w:r>
-        <w:rPr>
-          <w:rFonts w:ascii="Consolas" w:cs="Consolas" w:eastAsia="Consolas" w:hAnsi="Consolas"/>
-          <w:sz w:val="22"/>
-          <w:szCs w:val="22"/>
-          <w:shd w:fill="EEF1F5" w:val="clear"/>
-        </w:rPr>
-        <w:t xml:space="preserve">POST /users/{id}/tags</w:t>
-      </w:r>
-      <w:r>
-        <w:rPr>
-          <w:rFonts w:ascii="Calibri" w:cs="Calibri" w:eastAsia="Calibri" w:hAnsi="Calibri"/>
-          <w:sz w:val="22"/>
-          <w:szCs w:val="22"/>
-        </w:rPr>
-        <w:t xml:space="preserve">.</w:t>
+        <w:t xml:space="preserve">Acompanhamento da situação (pendente, ativa, falha ou revogada) por GET /users/{id}/tags.</w:t>
       </w:r>
     </w:p>
     <w:p>
@@ -5205,7 +5107,7 @@
           <w:sz w:val="22"/>
           <w:szCs w:val="22"/>
         </w:rPr>
-        <w:t xml:space="preserve">Permitir remover ou substituir uma tag, por exemplo em caso de perda.</w:t>
+        <w:t xml:space="preserve">Permitir revogar ou substituir uma tag, por exemplo em caso de perda.</w:t>
       </w:r>
     </w:p>
     <w:p>
@@ -6218,7 +6120,7 @@
                 <w:sz w:val="20"/>
                 <w:szCs w:val="20"/>
               </w:rPr>
-              <w:t xml:space="preserve">Vincular tag NFC</w:t>
+              <w:t xml:space="preserve">Pedir a gravação de tag NFC (o backend comanda o ESP32)</w:t>
             </w:r>
           </w:p>
         </w:tc>
@@ -6305,7 +6207,7 @@
                 <w:sz w:val="20"/>
                 <w:szCs w:val="20"/>
               </w:rPr>
-              <w:t xml:space="preserve">Remover tag</w:t>
+              <w:t xml:space="preserve">Revogar tag</w:t>
             </w:r>
           </w:p>
         </w:tc>
@@ -6625,24 +6527,7 @@
           <w:sz w:val="22"/>
           <w:szCs w:val="22"/>
         </w:rPr>
-        <w:t xml:space="preserve">O endereço configurável evita recompilar o app ao trocar de rede. No Android, é necessário habilitar </w:t>
-      </w:r>
-      <w:r>
-        <w:rPr>
-          <w:rFonts w:ascii="Consolas" w:cs="Consolas" w:eastAsia="Consolas" w:hAnsi="Consolas"/>
-          <w:sz w:val="22"/>
-          <w:szCs w:val="22"/>
-          <w:shd w:fill="EEF1F5" w:val="clear"/>
-        </w:rPr>
-        <w:t xml:space="preserve">usesCleartextTraffic</w:t>
-      </w:r>
-      <w:r>
-        <w:rPr>
-          <w:rFonts w:ascii="Calibri" w:cs="Calibri" w:eastAsia="Calibri" w:hAnsi="Calibri"/>
-          <w:sz w:val="22"/>
-          <w:szCs w:val="22"/>
-        </w:rPr>
-        <w:t xml:space="preserve"> para HTTP na LAN e conceder as permissões de câmera e NFC.</w:t>
+        <w:t xml:space="preserve">O endereço configurável evita recompilar o app ao trocar de rede. No Android, é necessário habilitar usesCleartextTraffic para HTTP na LAN e conceder a permissão de câmera.</w:t>
       </w:r>
     </w:p>
     <w:p>
@@ -6912,7 +6797,7 @@
                 <w:sz w:val="20"/>
                 <w:szCs w:val="20"/>
               </w:rPr>
-              <w:t xml:space="preserve">Cadastro da tag NFC que será lida no terminal</w:t>
+              <w:t xml:space="preserve">Pedido de gravação da tag NFC que será lida pelo ESP32 no terminal</w:t>
             </w:r>
           </w:p>
         </w:tc>
@@ -9445,24 +9330,7 @@
           <w:sz w:val="22"/>
           <w:szCs w:val="22"/>
         </w:rPr>
-        <w:t xml:space="preserve">O mobile-readings lê o UID e envia </w:t>
-      </w:r>
-      <w:r>
-        <w:rPr>
-          <w:rFonts w:ascii="Consolas" w:cs="Consolas" w:eastAsia="Consolas" w:hAnsi="Consolas"/>
-          <w:sz w:val="22"/>
-          <w:szCs w:val="22"/>
-          <w:shd w:fill="EEF1F5" w:val="clear"/>
-        </w:rPr>
-        <w:t xml:space="preserve">POST /access/nfc</w:t>
-      </w:r>
-      <w:r>
-        <w:rPr>
-          <w:rFonts w:ascii="Calibri" w:cs="Calibri" w:eastAsia="Calibri" w:hAnsi="Calibri"/>
-          <w:sz w:val="22"/>
-          <w:szCs w:val="22"/>
-        </w:rPr>
-        <w:t xml:space="preserve">.</w:t>
+        <w:t xml:space="preserve">O ESP32 lê o código gravado na tag e o publica em terminal/{id}/nfc.</w:t>
       </w:r>
     </w:p>
     <w:p>
@@ -9480,7 +9348,7 @@
           <w:sz w:val="22"/>
           <w:szCs w:val="22"/>
         </w:rPr>
-        <w:t xml:space="preserve">O backend localiza a tag, identifica o usuário e aplica as mesmas regras de autorização, sem o teste de geolocalização (a tag já foi apresentada fisicamente no terminal).</w:t>
+        <w:t xml:space="preserve">O backend calcula o hash do código, localiza a tag, identifica o usuário e aplica as mesmas regras de autorização, sem o teste de geolocalização (a tag já foi apresentada fisicamente no leitor). Publica o comando de abertura e o resultado.</w:t>
       </w:r>
     </w:p>
     <w:p>
@@ -10231,8 +10099,32 @@
                 <w:sz w:val="20"/>
                 <w:szCs w:val="20"/>
               </w:rPr>
-              <w:t xml:space="preserve">Confirmação de execução do comando (</w:t>
-            </w:r>
+              <w:t xml:space="preserve">Confirmação de execução do comando ou da gravação (requestId, type, result)</w:t>
+            </w:r>
+          </w:p>
+        </w:tc>
+      </w:tr>
+      <w:tr>
+        <w:trPr>
+          <w:cantSplit/>
+        </w:trPr>
+        <w:tc>
+          <w:tcPr>
+            <w:tcW w:type="dxa" w:w="2707"/>
+            <w:tcBorders>
+              <w:top w:val="single" w:color="BFC5CD" w:sz="4"/>
+              <w:left w:val="single" w:color="BFC5CD" w:sz="4"/>
+              <w:bottom w:val="single" w:color="BFC5CD" w:sz="4"/>
+              <w:right w:val="single" w:color="BFC5CD" w:sz="4"/>
+            </w:tcBorders>
+            <w:tcMar>
+              <w:top w:type="dxa" w:w="60"/>
+              <w:left w:type="dxa" w:w="100"/>
+              <w:bottom w:type="dxa" w:w="60"/>
+              <w:right w:type="dxa" w:w="100"/>
+            </w:tcMar>
+          </w:tcPr>
+          <w:p>
             <w:r>
               <w:rPr>
                 <w:rFonts w:ascii="Consolas" w:cs="Consolas" w:eastAsia="Consolas" w:hAnsi="Consolas"/>
@@ -10240,15 +10132,235 @@
                 <w:szCs w:val="20"/>
                 <w:shd w:fill="EEF1F5" w:val="clear"/>
               </w:rPr>
-              <w:t xml:space="preserve">requestId</w:t>
-            </w:r>
-            <w:r>
-              <w:rPr>
-                <w:rFonts w:ascii="Calibri" w:cs="Calibri" w:eastAsia="Calibri" w:hAnsi="Calibri"/>
-                <w:sz w:val="20"/>
-                <w:szCs w:val="20"/>
-              </w:rPr>
-              <w:t xml:space="preserve">)</w:t>
+              <w:t xml:space="preserve">terminal/{id}/nfc</w:t>
+            </w:r>
+          </w:p>
+        </w:tc>
+        <w:tc>
+          <w:tcPr>
+            <w:tcW w:type="dxa" w:w="1805"/>
+            <w:tcBorders>
+              <w:top w:val="single" w:color="BFC5CD" w:sz="4"/>
+              <w:left w:val="single" w:color="BFC5CD" w:sz="4"/>
+              <w:bottom w:val="single" w:color="BFC5CD" w:sz="4"/>
+              <w:right w:val="single" w:color="BFC5CD" w:sz="4"/>
+            </w:tcBorders>
+            <w:tcMar>
+              <w:top w:type="dxa" w:w="60"/>
+              <w:left w:type="dxa" w:w="100"/>
+              <w:bottom w:type="dxa" w:w="60"/>
+              <w:right w:type="dxa" w:w="100"/>
+            </w:tcMar>
+          </w:tcPr>
+          <w:p>
+            <w:r>
+              <w:rPr>
+                <w:rFonts w:ascii="Calibri" w:cs="Calibri" w:eastAsia="Calibri" w:hAnsi="Calibri"/>
+                <w:sz w:val="20"/>
+                <w:szCs w:val="20"/>
+              </w:rPr>
+              <w:t xml:space="preserve">ESP32 → backend</w:t>
+            </w:r>
+          </w:p>
+        </w:tc>
+        <w:tc>
+          <w:tcPr>
+            <w:tcW w:type="dxa" w:w="4514"/>
+            <w:tcBorders>
+              <w:top w:val="single" w:color="BFC5CD" w:sz="4"/>
+              <w:left w:val="single" w:color="BFC5CD" w:sz="4"/>
+              <w:bottom w:val="single" w:color="BFC5CD" w:sz="4"/>
+              <w:right w:val="single" w:color="BFC5CD" w:sz="4"/>
+            </w:tcBorders>
+            <w:tcMar>
+              <w:top w:type="dxa" w:w="60"/>
+              <w:left w:type="dxa" w:w="100"/>
+              <w:bottom w:type="dxa" w:w="60"/>
+              <w:right w:type="dxa" w:w="100"/>
+            </w:tcMar>
+          </w:tcPr>
+          <w:p>
+            <w:r>
+              <w:rPr>
+                <w:rFonts w:ascii="Calibri" w:cs="Calibri" w:eastAsia="Calibri" w:hAnsi="Calibri"/>
+                <w:sz w:val="20"/>
+                <w:szCs w:val="20"/>
+              </w:rPr>
+              <w:t xml:space="preserve">{code, uid, ts}: código lido da tag (o uid é opcional)</w:t>
+            </w:r>
+          </w:p>
+        </w:tc>
+      </w:tr>
+      <w:tr>
+        <w:trPr>
+          <w:cantSplit/>
+        </w:trPr>
+        <w:tc>
+          <w:tcPr>
+            <w:tcW w:type="dxa" w:w="2707"/>
+            <w:tcBorders>
+              <w:top w:val="single" w:color="BFC5CD" w:sz="4"/>
+              <w:left w:val="single" w:color="BFC5CD" w:sz="4"/>
+              <w:bottom w:val="single" w:color="BFC5CD" w:sz="4"/>
+              <w:right w:val="single" w:color="BFC5CD" w:sz="4"/>
+            </w:tcBorders>
+            <w:tcMar>
+              <w:top w:type="dxa" w:w="60"/>
+              <w:left w:type="dxa" w:w="100"/>
+              <w:bottom w:type="dxa" w:w="60"/>
+              <w:right w:type="dxa" w:w="100"/>
+            </w:tcMar>
+          </w:tcPr>
+          <w:p>
+            <w:r>
+              <w:rPr>
+                <w:rFonts w:ascii="Consolas" w:cs="Consolas" w:eastAsia="Consolas" w:hAnsi="Consolas"/>
+                <w:sz w:val="20"/>
+                <w:szCs w:val="20"/>
+                <w:shd w:fill="EEF1F5" w:val="clear"/>
+              </w:rPr>
+              <w:t xml:space="preserve">terminal/{id}/enroll</w:t>
+            </w:r>
+          </w:p>
+        </w:tc>
+        <w:tc>
+          <w:tcPr>
+            <w:tcW w:type="dxa" w:w="1805"/>
+            <w:tcBorders>
+              <w:top w:val="single" w:color="BFC5CD" w:sz="4"/>
+              <w:left w:val="single" w:color="BFC5CD" w:sz="4"/>
+              <w:bottom w:val="single" w:color="BFC5CD" w:sz="4"/>
+              <w:right w:val="single" w:color="BFC5CD" w:sz="4"/>
+            </w:tcBorders>
+            <w:tcMar>
+              <w:top w:type="dxa" w:w="60"/>
+              <w:left w:type="dxa" w:w="100"/>
+              <w:bottom w:type="dxa" w:w="60"/>
+              <w:right w:type="dxa" w:w="100"/>
+            </w:tcMar>
+          </w:tcPr>
+          <w:p>
+            <w:r>
+              <w:rPr>
+                <w:rFonts w:ascii="Calibri" w:cs="Calibri" w:eastAsia="Calibri" w:hAnsi="Calibri"/>
+                <w:sz w:val="20"/>
+                <w:szCs w:val="20"/>
+              </w:rPr>
+              <w:t xml:space="preserve">backend → ESP32</w:t>
+            </w:r>
+          </w:p>
+        </w:tc>
+        <w:tc>
+          <w:tcPr>
+            <w:tcW w:type="dxa" w:w="4514"/>
+            <w:tcBorders>
+              <w:top w:val="single" w:color="BFC5CD" w:sz="4"/>
+              <w:left w:val="single" w:color="BFC5CD" w:sz="4"/>
+              <w:bottom w:val="single" w:color="BFC5CD" w:sz="4"/>
+              <w:right w:val="single" w:color="BFC5CD" w:sz="4"/>
+            </w:tcBorders>
+            <w:tcMar>
+              <w:top w:type="dxa" w:w="60"/>
+              <w:left w:type="dxa" w:w="100"/>
+              <w:bottom w:type="dxa" w:w="60"/>
+              <w:right w:type="dxa" w:w="100"/>
+            </w:tcMar>
+          </w:tcPr>
+          <w:p>
+            <w:r>
+              <w:rPr>
+                <w:rFonts w:ascii="Calibri" w:cs="Calibri" w:eastAsia="Calibri" w:hAnsi="Calibri"/>
+                <w:sz w:val="20"/>
+                <w:szCs w:val="20"/>
+              </w:rPr>
+              <w:t xml:space="preserve">{requestId, code, expiresAt}: gravar o código na próxima tag apresentada</w:t>
+            </w:r>
+          </w:p>
+        </w:tc>
+      </w:tr>
+      <w:tr>
+        <w:trPr>
+          <w:cantSplit/>
+        </w:trPr>
+        <w:tc>
+          <w:tcPr>
+            <w:tcW w:type="dxa" w:w="2707"/>
+            <w:tcBorders>
+              <w:top w:val="single" w:color="BFC5CD" w:sz="4"/>
+              <w:left w:val="single" w:color="BFC5CD" w:sz="4"/>
+              <w:bottom w:val="single" w:color="BFC5CD" w:sz="4"/>
+              <w:right w:val="single" w:color="BFC5CD" w:sz="4"/>
+            </w:tcBorders>
+            <w:tcMar>
+              <w:top w:type="dxa" w:w="60"/>
+              <w:left w:type="dxa" w:w="100"/>
+              <w:bottom w:type="dxa" w:w="60"/>
+              <w:right w:type="dxa" w:w="100"/>
+            </w:tcMar>
+          </w:tcPr>
+          <w:p>
+            <w:r>
+              <w:rPr>
+                <w:rFonts w:ascii="Consolas" w:cs="Consolas" w:eastAsia="Consolas" w:hAnsi="Consolas"/>
+                <w:sz w:val="20"/>
+                <w:szCs w:val="20"/>
+                <w:shd w:fill="EEF1F5" w:val="clear"/>
+              </w:rPr>
+              <w:t xml:space="preserve">terminal/{id}/result</w:t>
+            </w:r>
+          </w:p>
+        </w:tc>
+        <w:tc>
+          <w:tcPr>
+            <w:tcW w:type="dxa" w:w="1805"/>
+            <w:tcBorders>
+              <w:top w:val="single" w:color="BFC5CD" w:sz="4"/>
+              <w:left w:val="single" w:color="BFC5CD" w:sz="4"/>
+              <w:bottom w:val="single" w:color="BFC5CD" w:sz="4"/>
+              <w:right w:val="single" w:color="BFC5CD" w:sz="4"/>
+            </w:tcBorders>
+            <w:tcMar>
+              <w:top w:type="dxa" w:w="60"/>
+              <w:left w:type="dxa" w:w="100"/>
+              <w:bottom w:type="dxa" w:w="60"/>
+              <w:right w:type="dxa" w:w="100"/>
+            </w:tcMar>
+          </w:tcPr>
+          <w:p>
+            <w:r>
+              <w:rPr>
+                <w:rFonts w:ascii="Calibri" w:cs="Calibri" w:eastAsia="Calibri" w:hAnsi="Calibri"/>
+                <w:sz w:val="20"/>
+                <w:szCs w:val="20"/>
+              </w:rPr>
+              <w:t xml:space="preserve">backend → mobile-readings</w:t>
+            </w:r>
+          </w:p>
+        </w:tc>
+        <w:tc>
+          <w:tcPr>
+            <w:tcW w:type="dxa" w:w="4514"/>
+            <w:tcBorders>
+              <w:top w:val="single" w:color="BFC5CD" w:sz="4"/>
+              <w:left w:val="single" w:color="BFC5CD" w:sz="4"/>
+              <w:bottom w:val="single" w:color="BFC5CD" w:sz="4"/>
+              <w:right w:val="single" w:color="BFC5CD" w:sz="4"/>
+            </w:tcBorders>
+            <w:tcMar>
+              <w:top w:type="dxa" w:w="60"/>
+              <w:left w:type="dxa" w:w="100"/>
+              <w:bottom w:type="dxa" w:w="60"/>
+              <w:right w:type="dxa" w:w="100"/>
+            </w:tcMar>
+          </w:tcPr>
+          <w:p>
+            <w:r>
+              <w:rPr>
+                <w:rFonts w:ascii="Calibri" w:cs="Calibri" w:eastAsia="Calibri" w:hAnsi="Calibri"/>
+                <w:sz w:val="20"/>
+                <w:szCs w:val="20"/>
+              </w:rPr>
+              <w:t xml:space="preserve">{result, reason, ts}: resultado do acesso, com motivo genérico</w:t>
             </w:r>
           </w:p>
         </w:tc>
@@ -11220,33 +11332,7 @@
                 <w:sz w:val="20"/>
                 <w:szCs w:val="20"/>
               </w:rPr>
-              <w:t xml:space="preserve">Chave de API ou token próprio por terminal, enviado pelo mobile-readings, para que apenas terminais cadastrados enviem </w:t>
-            </w:r>
-            <w:r>
-              <w:rPr>
-                <w:rFonts w:ascii="Consolas" w:cs="Consolas" w:eastAsia="Consolas" w:hAnsi="Consolas"/>
-                <w:sz w:val="20"/>
-                <w:szCs w:val="20"/>
-                <w:shd w:fill="EEF1F5" w:val="clear"/>
-              </w:rPr>
-              <w:t xml:space="preserve">/access/nfc</w:t>
-            </w:r>
-            <w:r>
-              <w:rPr>
-                <w:rFonts w:ascii="Calibri" w:cs="Calibri" w:eastAsia="Calibri" w:hAnsi="Calibri"/>
-                <w:sz w:val="20"/>
-                <w:szCs w:val="20"/>
-              </w:rPr>
-              <w:t xml:space="preserve"> e </w:t>
-            </w:r>
-            <w:r>
-              <w:rPr>
-                <w:rFonts w:ascii="Consolas" w:cs="Consolas" w:eastAsia="Consolas" w:hAnsi="Consolas"/>
-                <w:sz w:val="20"/>
-                <w:szCs w:val="20"/>
-                <w:shd w:fill="EEF1F5" w:val="clear"/>
-              </w:rPr>
-              <w:t xml:space="preserve">/access/face</w:t>
+              <w:t xml:space="preserve">Chave de API ou token próprio por terminal, enviado pelo mobile-readings, para que apenas terminais cadastrados enviem /access/face. Para o NFC, usuário e senha MQTT por terminal e ACL por tópico.</w:t>
             </w:r>
           </w:p>
         </w:tc>
@@ -12083,58 +12169,7 @@
                 <w:szCs w:val="20"/>
                 <w:shd w:fill="EEF1F5" w:val="clear"/>
               </w:rPr>
-              <w:t xml:space="preserve">POST /users/{id}/tags</w:t>
-            </w:r>
-            <w:r>
-              <w:rPr>
-                <w:rFonts w:ascii="Calibri" w:cs="Calibri" w:eastAsia="Calibri" w:hAnsi="Calibri"/>
-                <w:sz w:val="20"/>
-                <w:szCs w:val="20"/>
-              </w:rPr>
-              <w:t xml:space="preserve">, </w:t>
-            </w:r>
-            <w:r>
-              <w:rPr>
-                <w:rFonts w:ascii="Consolas" w:cs="Consolas" w:eastAsia="Consolas" w:hAnsi="Consolas"/>
-                <w:sz w:val="20"/>
-                <w:szCs w:val="20"/>
-                <w:shd w:fill="EEF1F5" w:val="clear"/>
-              </w:rPr>
-              <w:t xml:space="preserve">DELETE /users/{id}/tags/{tagId}</w:t>
-            </w:r>
-            <w:r>
-              <w:rPr>
-                <w:rFonts w:ascii="Calibri" w:cs="Calibri" w:eastAsia="Calibri" w:hAnsi="Calibri"/>
-                <w:sz w:val="20"/>
-                <w:szCs w:val="20"/>
-              </w:rPr>
-              <w:t xml:space="preserve">, </w:t>
-            </w:r>
-            <w:r>
-              <w:rPr>
-                <w:rFonts w:ascii="Consolas" w:cs="Consolas" w:eastAsia="Consolas" w:hAnsi="Consolas"/>
-                <w:sz w:val="20"/>
-                <w:szCs w:val="20"/>
-                <w:shd w:fill="EEF1F5" w:val="clear"/>
-              </w:rPr>
-              <w:t xml:space="preserve">POST /users/{id}/face</w:t>
-            </w:r>
-            <w:r>
-              <w:rPr>
-                <w:rFonts w:ascii="Calibri" w:cs="Calibri" w:eastAsia="Calibri" w:hAnsi="Calibri"/>
-                <w:sz w:val="20"/>
-                <w:szCs w:val="20"/>
-              </w:rPr>
-              <w:t xml:space="preserve">, </w:t>
-            </w:r>
-            <w:r>
-              <w:rPr>
-                <w:rFonts w:ascii="Consolas" w:cs="Consolas" w:eastAsia="Consolas" w:hAnsi="Consolas"/>
-                <w:sz w:val="20"/>
-                <w:szCs w:val="20"/>
-                <w:shd w:fill="EEF1F5" w:val="clear"/>
-              </w:rPr>
-              <w:t xml:space="preserve">GET /users/{id}/photo</w:t>
+              <w:t xml:space="preserve">POST /users/{id}/tags (pede a gravação), GET /users/{id}/tags, DELETE /users/{id}/tags/{tagId}, POST /users/{id}/face, GET /users/{id}/photo</w:t>
             </w:r>
           </w:p>
         </w:tc>
@@ -12645,41 +12680,7 @@
                 <w:szCs w:val="20"/>
                 <w:shd w:fill="EEF1F5" w:val="clear"/>
               </w:rPr>
-              <w:t xml:space="preserve">POST /access/qr</w:t>
-            </w:r>
-            <w:r>
-              <w:rPr>
-                <w:rFonts w:ascii="Calibri" w:cs="Calibri" w:eastAsia="Calibri" w:hAnsi="Calibri"/>
-                <w:sz w:val="20"/>
-                <w:szCs w:val="20"/>
-              </w:rPr>
-              <w:t xml:space="preserve">, </w:t>
-            </w:r>
-            <w:r>
-              <w:rPr>
-                <w:rFonts w:ascii="Consolas" w:cs="Consolas" w:eastAsia="Consolas" w:hAnsi="Consolas"/>
-                <w:sz w:val="20"/>
-                <w:szCs w:val="20"/>
-                <w:shd w:fill="EEF1F5" w:val="clear"/>
-              </w:rPr>
-              <w:t xml:space="preserve">/access/nfc</w:t>
-            </w:r>
-            <w:r>
-              <w:rPr>
-                <w:rFonts w:ascii="Calibri" w:cs="Calibri" w:eastAsia="Calibri" w:hAnsi="Calibri"/>
-                <w:sz w:val="20"/>
-                <w:szCs w:val="20"/>
-              </w:rPr>
-              <w:t xml:space="preserve">, </w:t>
-            </w:r>
-            <w:r>
-              <w:rPr>
-                <w:rFonts w:ascii="Consolas" w:cs="Consolas" w:eastAsia="Consolas" w:hAnsi="Consolas"/>
-                <w:sz w:val="20"/>
-                <w:szCs w:val="20"/>
-                <w:shd w:fill="EEF1F5" w:val="clear"/>
-              </w:rPr>
-              <w:t xml:space="preserve">/access/face</w:t>
+              <w:t xml:space="preserve">POST /access/qr, /access/face (o acesso por NFC chega por MQTT)</w:t>
             </w:r>
           </w:p>
         </w:tc>
@@ -14252,25 +14253,7 @@
           <w:sz w:val="22"/>
           <w:szCs w:val="22"/>
         </w:rPr>
-        <w:t xml:space="preserve">O </w:t>
-      </w:r>
-      <w:r>
-        <w:rPr>
-          <w:rFonts w:ascii="Calibri" w:cs="Calibri" w:eastAsia="Calibri" w:hAnsi="Calibri"/>
-          <w:b/>
-          <w:bCs/>
-          <w:sz w:val="22"/>
-          <w:szCs w:val="22"/>
-        </w:rPr>
-        <w:t xml:space="preserve">device-esp32</w:t>
-      </w:r>
-      <w:r>
-        <w:rPr>
-          <w:rFonts w:ascii="Calibri" w:cs="Calibri" w:eastAsia="Calibri" w:hAnsi="Calibri"/>
-          <w:sz w:val="22"/>
-          <w:szCs w:val="22"/>
-        </w:rPr>
-        <w:t xml:space="preserve"> é o dispositivo embarcado que representa o mecanismo físico de acesso (catraca ou porta). Ele tem três papéis: detectar a aproximação de uma pessoa, acionar a trava eletrônica quando o backend ordenar e sinalizar o resultado com o buzzer. Ele não toma decisões de acesso: apenas obedece comandos recebidos via MQTT e reporta o que percebe.</w:t>
+        <w:t xml:space="preserve">O device-esp32 é o dispositivo embarcado que representa o mecanismo físico de acesso (catraca ou porta). Ele tem cinco papéis: detectar a aproximação de uma pessoa, ler as tags NFC, gravar nas tags o código gerado pelo backend, acionar a trava eletrônica quando o backend ordenar e sinalizar o resultado com o buzzer. Ele não toma decisões de acesso: apenas obedece comandos recebidos via MQTT, publica o código lido e reporta o que percebe. Há um único ESP32, que lê e grava.</w:t>
       </w:r>
     </w:p>
     <w:p>
@@ -14283,7 +14266,7 @@
           <w:sz w:val="22"/>
           <w:szCs w:val="22"/>
         </w:rPr>
-        <w:t xml:space="preserve">Esse dispositivo cumpre o RP02 (integração com dispositivo físico com sensores e atuadores) e o RNF01 (dispositivo IoT embarcado). Junto com o mobile-readings, forma o Terminal de Acesso descrito no RF11: o app fornece tela e leitor NFC, e o ESP32 fornece sensor, atuador e sinalização.</w:t>
+        <w:t xml:space="preserve">Esse dispositivo cumpre o RP02 (integração com dispositivo físico com sensores e atuadores) e o RNF01 (dispositivo IoT embarcado). Junto com o mobile-readings, forma o Terminal de Acesso descrito no RF11: o app fornece a tela, e o ESP32 fornece leitor e gravador NFC, sensor, atuador e sinalização.</w:t>
       </w:r>
     </w:p>
     <w:p>
@@ -14455,6 +14438,60 @@
           <w:szCs w:val="22"/>
         </w:rPr>
         <w:t xml:space="preserve">Informar seu estado e permitir detectar queda (Last Will).</w:t>
+      </w:r>
+    </w:p>
+    <w:p>
+      <w:pPr>
+        <w:pStyle w:val="ListParagraph"/>
+        <w:numPr>
+          <w:ilvl w:val="0"/>
+          <w:numId w:val="2"/>
+        </w:numPr>
+        <w:spacing w:after="60"/>
+      </w:pPr>
+      <w:r>
+        <w:rPr>
+          <w:rFonts w:ascii="Calibri" w:cs="Calibri" w:eastAsia="Calibri" w:hAnsi="Calibri"/>
+          <w:sz w:val="22"/>
+          <w:szCs w:val="22"/>
+        </w:rPr>
+        <w:t xml:space="preserve">Ler o código gravado na tag NFC e publicá-lo em terminal/{id}/nfc (RF10, RF14).</w:t>
+      </w:r>
+    </w:p>
+    <w:p>
+      <w:pPr>
+        <w:pStyle w:val="ListParagraph"/>
+        <w:numPr>
+          <w:ilvl w:val="0"/>
+          <w:numId w:val="2"/>
+        </w:numPr>
+        <w:spacing w:after="60"/>
+      </w:pPr>
+      <w:r>
+        <w:rPr>
+          <w:rFonts w:ascii="Calibri" w:cs="Calibri" w:eastAsia="Calibri" w:hAnsi="Calibri"/>
+          <w:sz w:val="22"/>
+          <w:szCs w:val="22"/>
+        </w:rPr>
+        <w:t xml:space="preserve">Gravar na tag o código recebido em terminal/{id}/enroll, conferir a gravação e confirmar em terminal/{id}/ack.</w:t>
+      </w:r>
+    </w:p>
+    <w:p>
+      <w:pPr>
+        <w:pStyle w:val="ListParagraph"/>
+        <w:numPr>
+          <w:ilvl w:val="0"/>
+          <w:numId w:val="2"/>
+        </w:numPr>
+        <w:spacing w:after="60"/>
+      </w:pPr>
+      <w:r>
+        <w:rPr>
+          <w:rFonts w:ascii="Calibri" w:cs="Calibri" w:eastAsia="Calibri" w:hAnsi="Calibri"/>
+          <w:sz w:val="22"/>
+          <w:szCs w:val="22"/>
+        </w:rPr>
+        <w:t xml:space="preserve">Alternar entre os modos de leitura e de gravação com um único leitor.</w:t>
       </w:r>
     </w:p>
     <w:p>
@@ -15213,6 +15250,92 @@
                 <w:sz w:val="20"/>
                 <w:szCs w:val="20"/>
               </w:rPr>
+              <w:t xml:space="preserve">Leitor e gravador NFC</w:t>
+            </w:r>
+          </w:p>
+        </w:tc>
+        <w:tc>
+          <w:tcPr>
+            <w:tcW w:type="dxa" w:w="2707"/>
+            <w:tcBorders>
+              <w:top w:val="single" w:color="BFC5CD" w:sz="4"/>
+              <w:left w:val="single" w:color="BFC5CD" w:sz="4"/>
+              <w:bottom w:val="single" w:color="BFC5CD" w:sz="4"/>
+              <w:right w:val="single" w:color="BFC5CD" w:sz="4"/>
+            </w:tcBorders>
+            <w:tcMar>
+              <w:top w:type="dxa" w:w="60"/>
+              <w:left w:type="dxa" w:w="100"/>
+              <w:bottom w:type="dxa" w:w="60"/>
+              <w:right w:type="dxa" w:w="100"/>
+            </w:tcMar>
+          </w:tcPr>
+          <w:p>
+            <w:r>
+              <w:rPr>
+                <w:rFonts w:ascii="Calibri" w:cs="Calibri" w:eastAsia="Calibri" w:hAnsi="Calibri"/>
+                <w:sz w:val="20"/>
+                <w:szCs w:val="20"/>
+              </w:rPr>
+              <w:t xml:space="preserve">Lê e grava as tags (RF10, RF11)</w:t>
+            </w:r>
+          </w:p>
+        </w:tc>
+        <w:tc>
+          <w:tcPr>
+            <w:tcW w:type="dxa" w:w="3612"/>
+            <w:tcBorders>
+              <w:top w:val="single" w:color="BFC5CD" w:sz="4"/>
+              <w:left w:val="single" w:color="BFC5CD" w:sz="4"/>
+              <w:bottom w:val="single" w:color="BFC5CD" w:sz="4"/>
+              <w:right w:val="single" w:color="BFC5CD" w:sz="4"/>
+            </w:tcBorders>
+            <w:tcMar>
+              <w:top w:type="dxa" w:w="60"/>
+              <w:left w:type="dxa" w:w="100"/>
+              <w:bottom w:type="dxa" w:w="60"/>
+              <w:right w:type="dxa" w:w="100"/>
+            </w:tcMar>
+          </w:tcPr>
+          <w:p>
+            <w:r>
+              <w:rPr>
+                <w:rFonts w:ascii="Calibri" w:cs="Calibri" w:eastAsia="Calibri" w:hAnsi="Calibri"/>
+                <w:sz w:val="20"/>
+                <w:szCs w:val="20"/>
+              </w:rPr>
+              <w:t xml:space="preserve">Módulo de 13,56 MHz (RC522 ou PN532) por SPI ou I2C, em 3,3 V; tag com memória gravável</w:t>
+            </w:r>
+          </w:p>
+        </w:tc>
+      </w:tr>
+      <w:tr>
+        <w:trPr>
+          <w:cantSplit/>
+        </w:trPr>
+        <w:tc>
+          <w:tcPr>
+            <w:tcW w:type="dxa" w:w="2707"/>
+            <w:tcBorders>
+              <w:top w:val="single" w:color="BFC5CD" w:sz="4"/>
+              <w:left w:val="single" w:color="BFC5CD" w:sz="4"/>
+              <w:bottom w:val="single" w:color="BFC5CD" w:sz="4"/>
+              <w:right w:val="single" w:color="BFC5CD" w:sz="4"/>
+            </w:tcBorders>
+            <w:tcMar>
+              <w:top w:type="dxa" w:w="60"/>
+              <w:left w:type="dxa" w:w="100"/>
+              <w:bottom w:type="dxa" w:w="60"/>
+              <w:right w:type="dxa" w:w="100"/>
+            </w:tcMar>
+          </w:tcPr>
+          <w:p>
+            <w:r>
+              <w:rPr>
+                <w:rFonts w:ascii="Calibri" w:cs="Calibri" w:eastAsia="Calibri" w:hAnsi="Calibri"/>
+                <w:sz w:val="20"/>
+                <w:szCs w:val="20"/>
+              </w:rPr>
               <w:t xml:space="preserve">Fonte 12 V</w:t>
             </w:r>
           </w:p>
@@ -16815,6 +16938,182 @@
           </w:p>
         </w:tc>
       </w:tr>
+      <w:tr>
+        <w:trPr>
+          <w:cantSplit/>
+        </w:trPr>
+        <w:tc>
+          <w:tcPr>
+            <w:tcW w:type="dxa" w:w="2707"/>
+            <w:tcBorders>
+              <w:top w:val="single" w:color="BFC5CD" w:sz="4"/>
+              <w:left w:val="single" w:color="BFC5CD" w:sz="4"/>
+              <w:bottom w:val="single" w:color="BFC5CD" w:sz="4"/>
+              <w:right w:val="single" w:color="BFC5CD" w:sz="4"/>
+            </w:tcBorders>
+            <w:tcMar>
+              <w:top w:type="dxa" w:w="60"/>
+              <w:left w:type="dxa" w:w="100"/>
+              <w:bottom w:type="dxa" w:w="60"/>
+              <w:right w:type="dxa" w:w="100"/>
+            </w:tcMar>
+          </w:tcPr>
+          <w:p>
+            <w:r>
+              <w:rPr>
+                <w:rFonts w:ascii="Consolas" w:cs="Consolas" w:eastAsia="Consolas" w:hAnsi="Consolas"/>
+                <w:sz w:val="20"/>
+                <w:szCs w:val="20"/>
+                <w:shd w:fill="EEF1F5" w:val="clear"/>
+              </w:rPr>
+              <w:t xml:space="preserve">terminal/{id}/nfc</w:t>
+            </w:r>
+          </w:p>
+        </w:tc>
+        <w:tc>
+          <w:tcPr>
+            <w:tcW w:type="dxa" w:w="1805"/>
+            <w:tcBorders>
+              <w:top w:val="single" w:color="BFC5CD" w:sz="4"/>
+              <w:left w:val="single" w:color="BFC5CD" w:sz="4"/>
+              <w:bottom w:val="single" w:color="BFC5CD" w:sz="4"/>
+              <w:right w:val="single" w:color="BFC5CD" w:sz="4"/>
+            </w:tcBorders>
+            <w:tcMar>
+              <w:top w:type="dxa" w:w="60"/>
+              <w:left w:type="dxa" w:w="100"/>
+              <w:bottom w:type="dxa" w:w="60"/>
+              <w:right w:type="dxa" w:w="100"/>
+            </w:tcMar>
+          </w:tcPr>
+          <w:p>
+            <w:r>
+              <w:rPr>
+                <w:rFonts w:ascii="Calibri" w:cs="Calibri" w:eastAsia="Calibri" w:hAnsi="Calibri"/>
+                <w:sz w:val="20"/>
+                <w:szCs w:val="20"/>
+              </w:rPr>
+              <w:t xml:space="preserve">ESP32 → broker</w:t>
+            </w:r>
+          </w:p>
+        </w:tc>
+        <w:tc>
+          <w:tcPr>
+            <w:tcW w:type="dxa" w:w="4514"/>
+            <w:tcBorders>
+              <w:top w:val="single" w:color="BFC5CD" w:sz="4"/>
+              <w:left w:val="single" w:color="BFC5CD" w:sz="4"/>
+              <w:bottom w:val="single" w:color="BFC5CD" w:sz="4"/>
+              <w:right w:val="single" w:color="BFC5CD" w:sz="4"/>
+            </w:tcBorders>
+            <w:tcMar>
+              <w:top w:type="dxa" w:w="60"/>
+              <w:left w:type="dxa" w:w="100"/>
+              <w:bottom w:type="dxa" w:w="60"/>
+              <w:right w:type="dxa" w:w="100"/>
+            </w:tcMar>
+          </w:tcPr>
+          <w:p>
+            <w:r>
+              <w:rPr>
+                <w:rFonts w:ascii="Consolas" w:cs="Consolas" w:eastAsia="Consolas" w:hAnsi="Consolas"/>
+                <w:sz w:val="20"/>
+                <w:szCs w:val="20"/>
+                <w:shd w:fill="EEF1F5" w:val="clear"/>
+              </w:rPr>
+              <w:t xml:space="preserve">{code, uid, ts}</w:t>
+            </w:r>
+          </w:p>
+        </w:tc>
+      </w:tr>
+      <w:tr>
+        <w:trPr>
+          <w:cantSplit/>
+        </w:trPr>
+        <w:tc>
+          <w:tcPr>
+            <w:tcW w:type="dxa" w:w="2707"/>
+            <w:tcBorders>
+              <w:top w:val="single" w:color="BFC5CD" w:sz="4"/>
+              <w:left w:val="single" w:color="BFC5CD" w:sz="4"/>
+              <w:bottom w:val="single" w:color="BFC5CD" w:sz="4"/>
+              <w:right w:val="single" w:color="BFC5CD" w:sz="4"/>
+            </w:tcBorders>
+            <w:tcMar>
+              <w:top w:type="dxa" w:w="60"/>
+              <w:left w:type="dxa" w:w="100"/>
+              <w:bottom w:type="dxa" w:w="60"/>
+              <w:right w:type="dxa" w:w="100"/>
+            </w:tcMar>
+          </w:tcPr>
+          <w:p>
+            <w:r>
+              <w:rPr>
+                <w:rFonts w:ascii="Consolas" w:cs="Consolas" w:eastAsia="Consolas" w:hAnsi="Consolas"/>
+                <w:sz w:val="20"/>
+                <w:szCs w:val="20"/>
+                <w:shd w:fill="EEF1F5" w:val="clear"/>
+              </w:rPr>
+              <w:t xml:space="preserve">terminal/{id}/enroll</w:t>
+            </w:r>
+          </w:p>
+        </w:tc>
+        <w:tc>
+          <w:tcPr>
+            <w:tcW w:type="dxa" w:w="1805"/>
+            <w:tcBorders>
+              <w:top w:val="single" w:color="BFC5CD" w:sz="4"/>
+              <w:left w:val="single" w:color="BFC5CD" w:sz="4"/>
+              <w:bottom w:val="single" w:color="BFC5CD" w:sz="4"/>
+              <w:right w:val="single" w:color="BFC5CD" w:sz="4"/>
+            </w:tcBorders>
+            <w:tcMar>
+              <w:top w:type="dxa" w:w="60"/>
+              <w:left w:type="dxa" w:w="100"/>
+              <w:bottom w:type="dxa" w:w="60"/>
+              <w:right w:type="dxa" w:w="100"/>
+            </w:tcMar>
+          </w:tcPr>
+          <w:p>
+            <w:r>
+              <w:rPr>
+                <w:rFonts w:ascii="Calibri" w:cs="Calibri" w:eastAsia="Calibri" w:hAnsi="Calibri"/>
+                <w:sz w:val="20"/>
+                <w:szCs w:val="20"/>
+              </w:rPr>
+              <w:t xml:space="preserve">broker → ESP32</w:t>
+            </w:r>
+          </w:p>
+        </w:tc>
+        <w:tc>
+          <w:tcPr>
+            <w:tcW w:type="dxa" w:w="4514"/>
+            <w:tcBorders>
+              <w:top w:val="single" w:color="BFC5CD" w:sz="4"/>
+              <w:left w:val="single" w:color="BFC5CD" w:sz="4"/>
+              <w:bottom w:val="single" w:color="BFC5CD" w:sz="4"/>
+              <w:right w:val="single" w:color="BFC5CD" w:sz="4"/>
+            </w:tcBorders>
+            <w:tcMar>
+              <w:top w:type="dxa" w:w="60"/>
+              <w:left w:type="dxa" w:w="100"/>
+              <w:bottom w:type="dxa" w:w="60"/>
+              <w:right w:type="dxa" w:w="100"/>
+            </w:tcMar>
+          </w:tcPr>
+          <w:p>
+            <w:r>
+              <w:rPr>
+                <w:rFonts w:ascii="Consolas" w:cs="Consolas" w:eastAsia="Consolas" w:hAnsi="Consolas"/>
+                <w:sz w:val="20"/>
+                <w:szCs w:val="20"/>
+                <w:shd w:fill="EEF1F5" w:val="clear"/>
+              </w:rPr>
+              <w:t xml:space="preserve">{requestId, code, expiresAt}</w:t>
+            </w:r>
+          </w:p>
+        </w:tc>
+      </w:tr>
     </w:tbl>
     <w:p>
       <w:pPr>
@@ -20396,15 +20695,7 @@
           <w:sz w:val="22"/>
           <w:szCs w:val="22"/>
         </w:rPr>
-        <w:t xml:space="preserve">Tela e NFC no mobile-readings:</w:t>
-      </w:r>
-      <w:r>
-        <w:rPr>
-          <w:rFonts w:ascii="Calibri" w:cs="Calibri" w:eastAsia="Calibri" w:hAnsi="Calibri"/>
-          <w:sz w:val="22"/>
-          <w:szCs w:val="22"/>
-        </w:rPr>
-        <w:t xml:space="preserve"> o desafio lista tela e sensor NFC como parte do Terminal de Acesso. Como estão no celular, e não no ESP32, convém confirmar com o professor que essa divisão é aceita.</w:t>
+        <w:t xml:space="preserve">Leitor e gravador NFC no ESP32: o professor definiu que a leitura de tags é feita pelo ESP32, e o Product Owner definiu que o mesmo ESP32 grava as tags com um código gerado pelo backend. Falta definir o módulo (RC522 ou PN532) e o tipo de tag.</w:t>
       </w:r>
     </w:p>
     <w:p>
@@ -20804,7 +21095,7 @@
           <w:sz w:val="22"/>
           <w:szCs w:val="22"/>
         </w:rPr>
-        <w:t xml:space="preserve">Vincular e remover tags NFC de um usuário.</w:t>
+        <w:t xml:space="preserve">Pedir a gravação e revogar tags NFC de um usuário.</w:t>
       </w:r>
     </w:p>
     <w:p>
@@ -22360,7 +22651,7 @@
                 <w:sz w:val="20"/>
                 <w:szCs w:val="20"/>
               </w:rPr>
-              <w:t xml:space="preserve">A Web NFC API só funciona no Chrome para Android e exige HTTPS. No desktop, usar leitor USB que emula teclado (o UID cai em um campo de texto) ou digitar o UID. Padronizar o formato com o app</w:t>
+              <w:t xml:space="preserve">O navegador não lê nem grava NFC: o frontend pede a gravação ao backend (POST /users/{id}/tags), que comanda o ESP32. Leitor USB e Web NFC não são usados.</w:t>
             </w:r>
           </w:p>
         </w:tc>
@@ -25092,15 +25383,7 @@
           <w:sz w:val="22"/>
           <w:szCs w:val="22"/>
         </w:rPr>
-        <w:t xml:space="preserve">Escopo da redundância:</w:t>
-      </w:r>
-      <w:r>
-        <w:rPr>
-          <w:rFonts w:ascii="Calibri" w:cs="Calibri" w:eastAsia="Calibri" w:hAnsi="Calibri"/>
-          <w:sz w:val="22"/>
-          <w:szCs w:val="22"/>
-        </w:rPr>
-        <w:t xml:space="preserve"> o embedding facial não será cadastrado pelo frontend, e a tag NFC só pelo leitor USB ou digitação. Decidir se isso é aceitável como “redundância” ou se o frontend precisa de paridade total.</w:t>
+        <w:t xml:space="preserve">Escopo da redundância: o embedding facial não será cadastrado pelo frontend, mas o pedido de gravação de tags NFC tem paridade com o app. Decidir se a ausência do facial é aceitável como “redundância” ou se o frontend precisa de paridade total.</w:t>
       </w:r>
     </w:p>
     <w:p>

</xml_diff>